<commit_message>
Rebalance program schedule and align calendar with UPC holidays
- Align non-teaching dates with official UPC-FIB academic calendar
  (La Immaculada, Christmas break, UPC 9 Feb holiday)
- Rebalance M1/M5/M6 session counts: move Go from M1 into M6 right
  before building operators (just-in-time learning), split
  Observability into 3 sessions (metrics/logs/traces+correlation),
  keeping the program at 30 sessions / 90h / 12 ECTS overall
- Restructure session on application bundles (Kustomize -> Helm ->
  combined -> operator teaser) with a detailed 180-minute session
  script
- Regenerate calendario.md, .xlsx and .docx from generate_docs.py
- Add calendario-upc.pdf (official UPC calendar reference) and
  AGENT_NOTES.md (continuity notes for pending content changes)
- Add unrelated infra/codex-remote-ec2 Terraform scaffold
</commit_message>
<xml_diff>
--- a/Postgrado_Kubernetes_Platform_Engineering.docx
+++ b/Postgrado_Kubernetes_Platform_Engineering.docx
@@ -590,7 +590,7 @@
               <w:rPr>
                 <w:sz w:val="20"/>
               </w:rPr>
-              <w:t>1.5 ECTS · 12h</w:t>
+              <w:t>1.5 ECTS · 6h</w:t>
             </w:r>
           </w:p>
         </w:tc>
@@ -768,7 +768,7 @@
               <w:rPr>
                 <w:sz w:val="20"/>
               </w:rPr>
-              <w:t>2 ECTS · 15h</w:t>
+              <w:t>2 ECTS · 18h</w:t>
             </w:r>
           </w:p>
         </w:tc>
@@ -813,7 +813,7 @@
               <w:rPr>
                 <w:sz w:val="20"/>
               </w:rPr>
-              <w:t>2 ECTS · 15h</w:t>
+              <w:t>2 ECTS · 18h</w:t>
             </w:r>
           </w:p>
         </w:tc>
@@ -945,7 +945,7 @@
                 <w:color w:val="1A56DB"/>
                 <w:sz w:val="22"/>
               </w:rPr>
-              <w:t>M1 | 1.5 ECTS · 12h</w:t>
+              <w:t>M1 | 1.5 ECTS · 6h</w:t>
             </w:r>
             <w:r>
               <w:rPr>
@@ -963,7 +963,7 @@
                 <w:color w:val="4B5563"/>
                 <w:sz w:val="20"/>
               </w:rPr>
-              <w:t>Contextualización del movimiento DevOps y su evolución hacia Platform Engineering. Competencias de programación asistidas por inteligencia artificial en Bash, Python y Go orientadas a la automatización de infraestructura, desarrollo de CLIs y construcción de controladores para Kubernetes.</w:t>
+              <w:t>Contextualización del movimiento DevOps y su evolución hacia Platform Engineering. Competencias de programación asistidas por inteligencia artificial en Bash y Python orientadas a la automatización de infraestructura y desarrollo de CLIs. Go se introduce más adelante (M6), en el contexto de construcción de controladores para Kubernetes.</w:t>
             </w:r>
           </w:p>
           <w:p>
@@ -1097,7 +1097,7 @@
                 <w:color w:val="1A56DB"/>
                 <w:sz w:val="20"/>
               </w:rPr>
-              <w:t>▸ Programación para Infraestructura: Bash, Python y Go (asistida por IA)</w:t>
+              <w:t>▸ Bash y Python para DevOps (asistida por IA)</w:t>
             </w:r>
           </w:p>
           <w:p>
@@ -1121,7 +1121,7 @@
                 <w:color w:val="1F2A37"/>
                 <w:sz w:val="18"/>
               </w:rPr>
-              <w:t xml:space="preserve">     ›  Bash scripting avanzado: variables, estructuras de control, funciones, arrays y manejo de errores</w:t>
+              <w:t xml:space="preserve">     ›  Bash scripting: variables, estructuras de control, funciones, arrays y manejo de errores</w:t>
             </w:r>
           </w:p>
           <w:p>
@@ -1133,7 +1133,7 @@
                 <w:color w:val="1F2A37"/>
                 <w:sz w:val="18"/>
               </w:rPr>
-              <w:t xml:space="preserve">     ›  Automatización de sistema: gestión de procesos, pipes, redirecciones, grep/sed/awk/jq/yq, cron y Makefiles</w:t>
+              <w:t xml:space="preserve">     ›  Automatización de sistema: pipes, redirecciones, grep/sed/awk/jq/yq, cron y Makefiles</w:t>
             </w:r>
           </w:p>
           <w:p>
@@ -1169,55 +1169,7 @@
                 <w:color w:val="1F2A37"/>
                 <w:sz w:val="18"/>
               </w:rPr>
-              <w:t xml:space="preserve">     ›  Go: sintaxis, tipos, structs, interfaces, goroutines, channels y manejo de errores idiomático</w:t>
-            </w:r>
-          </w:p>
-          <w:p>
-            <w:pPr>
-              <w:spacing w:before="10" w:after="10"/>
-            </w:pPr>
-            <w:r>
-              <w:rPr>
-                <w:color w:val="1F2A37"/>
-                <w:sz w:val="18"/>
-              </w:rPr>
-              <w:t xml:space="preserve">     ›  Go para infraestructura: desarrollo de CLIs con cobra/viper y cliente Kubernetes (client-go)</w:t>
-            </w:r>
-          </w:p>
-          <w:p>
-            <w:pPr>
-              <w:spacing w:before="10" w:after="10"/>
-            </w:pPr>
-            <w:r>
-              <w:rPr>
-                <w:color w:val="1F2A37"/>
-                <w:sz w:val="18"/>
-              </w:rPr>
-              <w:t xml:space="preserve">     ›  Patrones de desarrollo de controladores y operators en Go: reconciliation loop e informers</w:t>
-            </w:r>
-          </w:p>
-          <w:p>
-            <w:pPr>
-              <w:spacing w:before="10" w:after="10"/>
-            </w:pPr>
-            <w:r>
-              <w:rPr>
-                <w:color w:val="1F2A37"/>
-                <w:sz w:val="18"/>
-              </w:rPr>
-              <w:t xml:space="preserve">     ›  Testing en Go: unit tests, table-driven tests, mocks con testify e integración con CI</w:t>
-            </w:r>
-          </w:p>
-          <w:p>
-            <w:pPr>
-              <w:spacing w:before="10" w:after="10"/>
-            </w:pPr>
-            <w:r>
-              <w:rPr>
-                <w:color w:val="1F2A37"/>
-                <w:sz w:val="18"/>
-              </w:rPr>
-              <w:t xml:space="preserve">     ›  Herramientas de desarrollo: Makefile, direnv, pre-commit hooks y linters (golangci-lint, ruff)</w:t>
+              <w:t xml:space="preserve">     ›  Calidad de código: linting con ruff, type checking con mypy, pre-commit hooks</w:t>
             </w:r>
           </w:p>
         </w:tc>
@@ -2392,7 +2344,7 @@
                 <w:color w:val="1F2A37"/>
                 <w:sz w:val="18"/>
               </w:rPr>
-              <w:t xml:space="preserve">     ›  Helm: charts, templates, values, hooks, repositorios, helm-secrets y helm-diff</w:t>
+              <w:t xml:space="preserve">     ›  Kustomize: bases, overlays, patches, generators y transformers. 2 ejemplos prácticos (dev/prod)</w:t>
             </w:r>
           </w:p>
           <w:p>
@@ -2404,7 +2356,7 @@
                 <w:color w:val="1F2A37"/>
                 <w:sz w:val="18"/>
               </w:rPr>
-              <w:t xml:space="preserve">     ›  Kustomize: bases, overlays, patches, generators y transformers. Helm + Kustomize</w:t>
+              <w:t xml:space="preserve">     ›  Helm: charts, templates, values, hooks. El catálogo de Helm (Artifact Hub) como ecosistema de distribución</w:t>
             </w:r>
           </w:p>
           <w:p>
@@ -2416,7 +2368,7 @@
                 <w:color w:val="1F2A37"/>
                 <w:sz w:val="18"/>
               </w:rPr>
-              <w:t xml:space="preserve">     ›  Patrón Operator: CRDs, controller loop, Operator Lifecycle Manager, niveles de madurez</w:t>
+              <w:t xml:space="preserve">     ›  Helm + Kustomize: helm-secrets, helm-diff. Combinar render de Helm con overlays Kustomize por entorno</w:t>
             </w:r>
           </w:p>
           <w:p>
@@ -2428,7 +2380,7 @@
                 <w:color w:val="1F2A37"/>
                 <w:sz w:val="18"/>
               </w:rPr>
-              <w:t xml:space="preserve">     ›  Operators de referencia: cert-manager, Prometheus Operator, Strimzi, Crossplane</w:t>
+              <w:t xml:space="preserve">     ›  Caso real: charts que despliegan operators (kube-prometheus-stack, Grafana Operator). Se profundiza en la Sesión 24</w:t>
             </w:r>
           </w:p>
           <w:p>
@@ -2632,7 +2584,7 @@
                 <w:color w:val="1A56DB"/>
                 <w:sz w:val="22"/>
               </w:rPr>
-              <w:t>M5 | 2 ECTS · 15h</w:t>
+              <w:t>M5 | 2 ECTS · 18h</w:t>
             </w:r>
             <w:r>
               <w:rPr>
@@ -2650,7 +2602,7 @@
                 <w:color w:val="4B5563"/>
                 <w:sz w:val="20"/>
               </w:rPr>
-              <w:t>Stack de observabilidad completo: Prometheus, Grafana (Loki, Tempo, Mimir), OpenTelemetry. GitOps con ArgoCD y Prow. Pipelines con Tekton. Networking avanzado con Traefik e Istio (service mesh). Estrategias de despliegue (canary, blue/green) con Argo Rollouts. Escalado de workloads (HPA, VPA, KEDA, Karpenter).</w:t>
+              <w:t>Stack de observabilidad completo: Prometheus, Grafana (Loki, Tempo, Mimir), OpenTelemetry, repartido en 3 sesiones (métricas, logs, trazas+correlación) para un ritmo sostenible. GitOps con ArgoCD y Prow. Pipelines con Tekton. Networking avanzado con Traefik e Istio (service mesh). Estrategias de despliegue (canary, blue/green) con Argo Rollouts. Escalado de workloads (HPA, VPA, KEDA, Karpenter).</w:t>
             </w:r>
           </w:p>
           <w:p>
@@ -2663,7 +2615,7 @@
                 <w:color w:val="1A56DB"/>
                 <w:sz w:val="20"/>
               </w:rPr>
-              <w:t>▸ Observabilidad</w:t>
+              <w:t>▸ Observabilidad (I): Métricas</w:t>
             </w:r>
           </w:p>
           <w:p>
@@ -2704,14 +2656,15 @@
           </w:p>
           <w:p>
             <w:pPr>
-              <w:spacing w:before="10" w:after="10"/>
+              <w:spacing w:before="40" w:after="20"/>
             </w:pPr>
             <w:r>
               <w:rPr>
-                <w:color w:val="1F2A37"/>
-                <w:sz w:val="18"/>
-              </w:rPr>
-              <w:t xml:space="preserve">     ›  Grafana: datasources, dashboards, variables, alerting. Grafana as Code (grafonnet, Terraform)</w:t>
+                <w:b/>
+                <w:color w:val="1A56DB"/>
+                <w:sz w:val="20"/>
+              </w:rPr>
+              <w:t>▸ Observabilidad (II): Grafana y Logs</w:t>
             </w:r>
           </w:p>
           <w:p>
@@ -2723,7 +2676,7 @@
                 <w:color w:val="1F2A37"/>
                 <w:sz w:val="18"/>
               </w:rPr>
-              <w:t xml:space="preserve">     ›  Grafana stack: Loki (logs), Tempo (trazas), Mimir (métricas), Alloy (collector)</w:t>
+              <w:t xml:space="preserve">     ›  Grafana: datasources, dashboards, variables, alerting. Grafana as Code (grafonnet, Terraform)</w:t>
             </w:r>
           </w:p>
           <w:p>
@@ -2735,7 +2688,7 @@
                 <w:color w:val="1F2A37"/>
                 <w:sz w:val="18"/>
               </w:rPr>
-              <w:t xml:space="preserve">     ›  OpenTelemetry: especificación OTLP, Collector pipelines, auto-instrumentación en Kubernetes</w:t>
+              <w:t xml:space="preserve">     ›  Loki: arquitectura, LogQL (mismo modelo mental que PromQL), labels vs indexación de texto completo</w:t>
             </w:r>
           </w:p>
           <w:p>
@@ -2747,7 +2700,92 @@
                 <w:color w:val="1F2A37"/>
                 <w:sz w:val="18"/>
               </w:rPr>
-              <w:t xml:space="preserve">     ›  Stack completo: Prometheus + Grafana + Loki + Tempo + OTel Collector integrados</w:t>
+              <w:t xml:space="preserve">     ›  Promtail: recolección de logs de los Pods y envío a Loki</w:t>
+            </w:r>
+          </w:p>
+          <w:p>
+            <w:pPr>
+              <w:spacing w:before="10" w:after="10"/>
+            </w:pPr>
+            <w:r>
+              <w:rPr>
+                <w:color w:val="1F2A37"/>
+                <w:sz w:val="18"/>
+              </w:rPr>
+              <w:t xml:space="preserve">     ›  Grafana Explore: consulta y filtrado de logs por label en tiempo real</w:t>
+            </w:r>
+          </w:p>
+          <w:p>
+            <w:pPr>
+              <w:spacing w:before="40" w:after="20"/>
+            </w:pPr>
+            <w:r>
+              <w:rPr>
+                <w:b/>
+                <w:color w:val="1A56DB"/>
+                <w:sz w:val="20"/>
+              </w:rPr>
+              <w:t>▸ Observabilidad (III): OpenTelemetry, Tempo y Correlación</w:t>
+            </w:r>
+          </w:p>
+          <w:p>
+            <w:pPr>
+              <w:spacing w:before="10" w:after="10"/>
+            </w:pPr>
+            <w:r>
+              <w:rPr>
+                <w:color w:val="1F2A37"/>
+                <w:sz w:val="18"/>
+              </w:rPr>
+              <w:t xml:space="preserve">     ›  OpenTelemetry: especificación OTLP, SDK, auto-instrumentación de la app sin tocar código</w:t>
+            </w:r>
+          </w:p>
+          <w:p>
+            <w:pPr>
+              <w:spacing w:before="10" w:after="10"/>
+            </w:pPr>
+            <w:r>
+              <w:rPr>
+                <w:color w:val="1F2A37"/>
+                <w:sz w:val="18"/>
+              </w:rPr>
+              <w:t xml:space="preserve">     ›  OpenTelemetry Collector: pipeline de receivers, processors y exporters</w:t>
+            </w:r>
+          </w:p>
+          <w:p>
+            <w:pPr>
+              <w:spacing w:before="10" w:after="10"/>
+            </w:pPr>
+            <w:r>
+              <w:rPr>
+                <w:color w:val="1F2A37"/>
+                <w:sz w:val="18"/>
+              </w:rPr>
+              <w:t xml:space="preserve">     ›  Tempo: backend de trazas distribuidas, trace ID, spans, integración con Grafana</w:t>
+            </w:r>
+          </w:p>
+          <w:p>
+            <w:pPr>
+              <w:spacing w:before="10" w:after="10"/>
+            </w:pPr>
+            <w:r>
+              <w:rPr>
+                <w:color w:val="1F2A37"/>
+                <w:sz w:val="18"/>
+              </w:rPr>
+              <w:t xml:space="preserve">     ›  Mimir: métricas a escala/federadas (mención breve, complementa Prometheus de la Sesión 19)</w:t>
+            </w:r>
+          </w:p>
+          <w:p>
+            <w:pPr>
+              <w:spacing w:before="10" w:after="10"/>
+            </w:pPr>
+            <w:r>
+              <w:rPr>
+                <w:color w:val="1F2A37"/>
+                <w:sz w:val="18"/>
+              </w:rPr>
+              <w:t xml:space="preserve">     ›  Correlación end-to-end: exemplars, salto métrica→traza→logs en un mismo dashboard</w:t>
             </w:r>
           </w:p>
           <w:p>
@@ -3061,7 +3099,7 @@
                 <w:color w:val="1A56DB"/>
                 <w:sz w:val="22"/>
               </w:rPr>
-              <w:t>M6 | 2 ECTS · 15h</w:t>
+              <w:t>M6 | 2 ECTS · 18h</w:t>
             </w:r>
             <w:r>
               <w:rPr>
@@ -3079,7 +3117,68 @@
                 <w:color w:val="4B5563"/>
                 <w:sz w:val="20"/>
               </w:rPr>
-              <w:t>Construcción de operators personalizados con Kubebuilder/Operator SDK. Gestión del ciclo de vida de clústeres con Cluster API. Serverless con Knative. Hosted Control Planes (HyperShift, vCluster, Kamaji). Gestión y despliegue multi-cluster (Istio multicluster, Cilium Cluster Mesh, Submariner) y multi-cloud con Crossplane. Disaster Recovery con Velero.</w:t>
+              <w:t>Go desde cero hasta cliente de la API de Kubernetes, como base para construir operators personalizados con Kubebuilder/Operator SDK. Gestión del ciclo de vida de clústeres con Cluster API. Serverless con Knative. Hosted Control Planes (HyperShift, vCluster, Kamaji). Gestión y despliegue multi-cluster (Istio multicluster, Cilium Cluster Mesh, Submariner) y multi-cloud con Crossplane. Disaster Recovery con Velero.</w:t>
+            </w:r>
+          </w:p>
+          <w:p>
+            <w:pPr>
+              <w:spacing w:before="40" w:after="20"/>
+            </w:pPr>
+            <w:r>
+              <w:rPr>
+                <w:b/>
+                <w:color w:val="1A56DB"/>
+                <w:sz w:val="20"/>
+              </w:rPr>
+              <w:t>▸ Go: de cero a controlador de Kubernetes</w:t>
+            </w:r>
+          </w:p>
+          <w:p>
+            <w:pPr>
+              <w:spacing w:before="10" w:after="10"/>
+            </w:pPr>
+            <w:r>
+              <w:rPr>
+                <w:color w:val="1F2A37"/>
+                <w:sz w:val="18"/>
+              </w:rPr>
+              <w:t xml:space="preserve">     ›  Fundamentos de Go: tipos, structs, interfaces, goroutines, channels, manejo de errores idiomático</w:t>
+            </w:r>
+          </w:p>
+          <w:p>
+            <w:pPr>
+              <w:spacing w:before="10" w:after="10"/>
+            </w:pPr>
+            <w:r>
+              <w:rPr>
+                <w:color w:val="1F2A37"/>
+                <w:sz w:val="18"/>
+              </w:rPr>
+              <w:t xml:space="preserve">     ›  client-go: clientset, kubeconfig, serialización, listar/filtrar/crear recursos de la API</w:t>
+            </w:r>
+          </w:p>
+          <w:p>
+            <w:pPr>
+              <w:spacing w:before="10" w:after="10"/>
+            </w:pPr>
+            <w:r>
+              <w:rPr>
+                <w:color w:val="1F2A37"/>
+                <w:sz w:val="18"/>
+              </w:rPr>
+              <w:t xml:space="preserve">     ›  controller-runtime: reconciliation loop, informers, predicates (fundamentos, sin construir el operator todavía)</w:t>
+            </w:r>
+          </w:p>
+          <w:p>
+            <w:pPr>
+              <w:spacing w:before="10" w:after="10"/>
+            </w:pPr>
+            <w:r>
+              <w:rPr>
+                <w:color w:val="1F2A37"/>
+                <w:sz w:val="18"/>
+              </w:rPr>
+              <w:t xml:space="preserve">     ›  CLIs y tooling: cobra/viper, logging estructurado, go test, mocks con testify, golangci-lint</w:t>
             </w:r>
           </w:p>
           <w:p>

</xml_diff>

<commit_message>
Sincronizar documentos y registrar posible ampliación de IaC
</commit_message>
<xml_diff>
--- a/Postgrado_Kubernetes_Platform_Engineering.docx
+++ b/Postgrado_Kubernetes_Platform_Engineering.docx
@@ -635,7 +635,7 @@
               <w:rPr>
                 <w:sz w:val="20"/>
               </w:rPr>
-              <w:t>1 ECTS · 12h</w:t>
+              <w:t>1 ECTS · 9h</w:t>
             </w:r>
           </w:p>
         </w:tc>
@@ -768,7 +768,7 @@
               <w:rPr>
                 <w:sz w:val="20"/>
               </w:rPr>
-              <w:t>2 ECTS · 18h</w:t>
+              <w:t>2 ECTS · 21h</w:t>
             </w:r>
           </w:p>
         </w:tc>
@@ -1204,7 +1204,7 @@
                 <w:color w:val="1A56DB"/>
                 <w:sz w:val="22"/>
               </w:rPr>
-              <w:t>M2 | 1 ECTS · 12h</w:t>
+              <w:t>M2 | 1 ECTS · 9h</w:t>
             </w:r>
             <w:r>
               <w:rPr>
@@ -1222,7 +1222,7 @@
                 <w:color w:val="4B5563"/>
                 <w:sz w:val="20"/>
               </w:rPr>
-              <w:t>Recursos fundamentales de AWS, Azure y GCP (computación, redes, almacenamiento, identidad y servicios gestionados). Terraform como herramienta central de aprovisionamiento declarativo multi-cloud: HCL, gestión del estado, módulos, testing y CI/CD. Redes, DNS y CDNs con Cloudflare. Control de versiones avanzado con Git.</w:t>
+              <w:t>Infraestructura cloud básica con Terraform/OpenTofu integrado en tres sesiones. AWS como caso principal; Azure y GCP como transferencia del mismo patrón, con ejemplos preparados. Identidad, redes, máquinas virtuales y almacenamiento. Comparación breve con Pulumi, sin laboratorio propio. Kubernetes gestionado y su aprovisionamiento se abordan en M4.</w:t>
             </w:r>
           </w:p>
           <w:p>
@@ -1235,7 +1235,7 @@
                 <w:color w:val="1A56DB"/>
                 <w:sz w:val="20"/>
               </w:rPr>
-              <w:t>▸ Redes, DNS y CDN con Cloudflare</w:t>
+              <w:t>▸ AWS y fundamentos de Terraform/OpenTofu</w:t>
             </w:r>
           </w:p>
           <w:p>
@@ -1247,7 +1247,7 @@
                 <w:color w:val="1F2A37"/>
                 <w:sz w:val="18"/>
               </w:rPr>
-              <w:t xml:space="preserve">     ›  Revisión de fundamentos TCP/IP, UDP, TLS 1.3/mTLS, HTTP/2 y HTTP/3 (QUIC)</w:t>
+              <w:t xml:space="preserve">     ›  AWS: IAM, regiones y zonas, VPC, subredes, Security Groups, EC2 y S3; contexto de ECR</w:t>
             </w:r>
           </w:p>
           <w:p>
@@ -1259,7 +1259,7 @@
                 <w:color w:val="1F2A37"/>
                 <w:sz w:val="18"/>
               </w:rPr>
-              <w:t xml:space="preserve">     ›  DNS: resolución recursiva e iterativa, registros (A, AAAA, CNAME, TXT, SRV, NS), TTL y propagación</w:t>
+              <w:t xml:space="preserve">     ›  Fundamentos IaC: declarativo, idempotencia y drift; Terraform/OpenTofu, HCL, provider y recursos</w:t>
             </w:r>
           </w:p>
           <w:p>
@@ -1271,7 +1271,20 @@
                 <w:color w:val="1F2A37"/>
                 <w:sz w:val="18"/>
               </w:rPr>
-              <w:t xml:space="preserve">     ›  DNS avanzado: DNSSEC, DNS-over-HTTPS, split-horizon DNS y service discovery basado en DNS</w:t>
+              <w:t xml:space="preserve">     ›  Caso práctico común: red, máquina virtual y almacenamiento; init, plan, apply y destroy; permisos y control de costes</w:t>
+            </w:r>
+          </w:p>
+          <w:p>
+            <w:pPr>
+              <w:spacing w:before="40" w:after="20"/>
+            </w:pPr>
+            <w:r>
+              <w:rPr>
+                <w:b/>
+                <w:color w:val="1A56DB"/>
+                <w:sz w:val="20"/>
+              </w:rPr>
+              <w:t>▸ Azure e IaC: equivalencias y módulos</w:t>
             </w:r>
           </w:p>
           <w:p>
@@ -1283,7 +1296,7 @@
                 <w:color w:val="1F2A37"/>
                 <w:sz w:val="18"/>
               </w:rPr>
-              <w:t xml:space="preserve">     ›  CDN: arquitectura, edge caching, routing geográfico, invalidación y cache-control headers</w:t>
+              <w:t xml:space="preserve">     ›  Azure: Entra ID, suscripciones, grupos de recursos, Managed Identities, VNet, NSG, máquinas virtuales y Blob Storage; contexto de ACR</w:t>
             </w:r>
           </w:p>
           <w:p>
@@ -1295,7 +1308,7 @@
                 <w:color w:val="1F2A37"/>
                 <w:sz w:val="18"/>
               </w:rPr>
-              <w:t xml:space="preserve">     ›  Cloudflare: DNS authoritative, Cloudflare Tunnel, Workers, WAF, DDoS protection y R2</w:t>
+              <w:t xml:space="preserve">     ›  Transferencia del caso AWS a Azure con configuración preparada: equivalencias y diferencias</w:t>
             </w:r>
           </w:p>
           <w:p>
@@ -1307,7 +1320,20 @@
                 <w:color w:val="1F2A37"/>
                 <w:sz w:val="18"/>
               </w:rPr>
-              <w:t xml:space="preserve">     ›  Certificados TLS: PKI, cadena de confianza, ACME protocol y automatización con Let's Encrypt</w:t>
+              <w:t xml:space="preserve">     ›  Terraform/OpenTofu: variables, outputs y uso de módulos existentes; sin diseño avanzado de módulos propios</w:t>
+            </w:r>
+          </w:p>
+          <w:p>
+            <w:pPr>
+              <w:spacing w:before="40" w:after="20"/>
+            </w:pPr>
+            <w:r>
+              <w:rPr>
+                <w:b/>
+                <w:color w:val="1A56DB"/>
+                <w:sz w:val="20"/>
+              </w:rPr>
+              <w:t>▸ GCP e IaC: estado y comparativa multicloud</w:t>
             </w:r>
           </w:p>
           <w:p>
@@ -1319,20 +1345,7 @@
                 <w:color w:val="1F2A37"/>
                 <w:sz w:val="18"/>
               </w:rPr>
-              <w:t xml:space="preserve">     ›  Load balancing: algoritmos, health checks, session persistence y global load balancing</w:t>
-            </w:r>
-          </w:p>
-          <w:p>
-            <w:pPr>
-              <w:spacing w:before="40" w:after="20"/>
-            </w:pPr>
-            <w:r>
-              <w:rPr>
-                <w:b/>
-                <w:color w:val="1A56DB"/>
-                <w:sz w:val="20"/>
-              </w:rPr>
-              <w:t>▸ Control de Versiones Avanzado con Git</w:t>
+              <w:t xml:space="preserve">     ›  GCP: proyectos, cuentas de servicio, IAM, VPC, firewall, Compute Engine y Cloud Storage; contexto de Artifact Registry</w:t>
             </w:r>
           </w:p>
           <w:p>
@@ -1344,7 +1357,7 @@
                 <w:color w:val="1F2A37"/>
                 <w:sz w:val="18"/>
               </w:rPr>
-              <w:t xml:space="preserve">     ›  Arquitectura interna de Git: objects (blob, tree, commit, tag), refs, packfiles, reflog y garbage collection</w:t>
+              <w:t xml:space="preserve">     ›  Transferencia del mismo caso a GCP con configuración preparada; comparación de identidad, redes, permisos y portabilidad</w:t>
             </w:r>
           </w:p>
           <w:p>
@@ -1356,7 +1369,7 @@
                 <w:color w:val="1F2A37"/>
                 <w:sz w:val="18"/>
               </w:rPr>
-              <w:t xml:space="preserve">     ›  Estrategias de branching: Git Flow, GitHub Flow, trunk-based development y comparativa práctica</w:t>
+              <w:t xml:space="preserve">     ›  Terraform/OpenTofu: estado local y remoto, locking según backend y protección del estado y de las credenciales</w:t>
             </w:r>
           </w:p>
           <w:p>
@@ -1368,405 +1381,7 @@
                 <w:color w:val="1F2A37"/>
                 <w:sz w:val="18"/>
               </w:rPr>
-              <w:t xml:space="preserve">     ›  Rebases interactivos: squash, fixup, reword, edit y reordenación de commits</w:t>
-            </w:r>
-          </w:p>
-          <w:p>
-            <w:pPr>
-              <w:spacing w:before="10" w:after="10"/>
-            </w:pPr>
-            <w:r>
-              <w:rPr>
-                <w:color w:val="1F2A37"/>
-                <w:sz w:val="18"/>
-              </w:rPr>
-              <w:t xml:space="preserve">     ›  Resolución de conflictos: estrategias de merge (recursive, ort), rerere, git mergetool y best practices</w:t>
-            </w:r>
-          </w:p>
-          <w:p>
-            <w:pPr>
-              <w:spacing w:before="10" w:after="10"/>
-            </w:pPr>
-            <w:r>
-              <w:rPr>
-                <w:color w:val="1F2A37"/>
-                <w:sz w:val="18"/>
-              </w:rPr>
-              <w:t xml:space="preserve">     ›  Gestión de ramas: naming conventions, branch protection rules, CODEOWNERS y cleanup automático</w:t>
-            </w:r>
-          </w:p>
-          <w:p>
-            <w:pPr>
-              <w:spacing w:before="10" w:after="10"/>
-            </w:pPr>
-            <w:r>
-              <w:rPr>
-                <w:color w:val="1F2A37"/>
-                <w:sz w:val="18"/>
-              </w:rPr>
-              <w:t xml:space="preserve">     ›  Pull Requests y code review: merge strategies (merge, squash, rebase), signed commits y draft PRs</w:t>
-            </w:r>
-          </w:p>
-          <w:p>
-            <w:pPr>
-              <w:spacing w:before="10" w:after="10"/>
-            </w:pPr>
-            <w:r>
-              <w:rPr>
-                <w:color w:val="1F2A37"/>
-                <w:sz w:val="18"/>
-              </w:rPr>
-              <w:t xml:space="preserve">     ›  Git hooks: pre-commit, commit-msg, post-merge y automatización con pre-commit framework</w:t>
-            </w:r>
-          </w:p>
-          <w:p>
-            <w:pPr>
-              <w:spacing w:before="10" w:after="10"/>
-            </w:pPr>
-            <w:r>
-              <w:rPr>
-                <w:color w:val="1F2A37"/>
-                <w:sz w:val="18"/>
-              </w:rPr>
-              <w:t xml:space="preserve">     ›  Monorepos: estrategias, herramientas (Nx, Turborepo) y gestión de dependencias</w:t>
-            </w:r>
-          </w:p>
-          <w:p>
-            <w:pPr>
-              <w:spacing w:before="10" w:after="10"/>
-            </w:pPr>
-            <w:r>
-              <w:rPr>
-                <w:color w:val="1F2A37"/>
-                <w:sz w:val="18"/>
-              </w:rPr>
-              <w:t xml:space="preserve">     ›  Operaciones avanzadas: git bisect, git worktree, submodules, subtrees y sparse-checkout</w:t>
-            </w:r>
-          </w:p>
-          <w:p>
-            <w:pPr>
-              <w:spacing w:before="40" w:after="20"/>
-            </w:pPr>
-            <w:r>
-              <w:rPr>
-                <w:b/>
-                <w:color w:val="1A56DB"/>
-                <w:sz w:val="20"/>
-              </w:rPr>
-              <w:t>▸ Cloud Computing: AWS, Azure y GCP</w:t>
-            </w:r>
-          </w:p>
-          <w:p>
-            <w:pPr>
-              <w:spacing w:before="10" w:after="10"/>
-            </w:pPr>
-            <w:r>
-              <w:rPr>
-                <w:color w:val="1F2A37"/>
-                <w:sz w:val="18"/>
-              </w:rPr>
-              <w:t xml:space="preserve">     ›  AWS · IAM: users, roles, policies, OIDC federation, IRSA y AWS SSO</w:t>
-            </w:r>
-          </w:p>
-          <w:p>
-            <w:pPr>
-              <w:spacing w:before="10" w:after="10"/>
-            </w:pPr>
-            <w:r>
-              <w:rPr>
-                <w:color w:val="1F2A37"/>
-                <w:sz w:val="18"/>
-              </w:rPr>
-              <w:t xml:space="preserve">     ›  AWS · Computación: EC2 (instance types, AMIs, user-data), Auto Scaling Groups, Lambda</w:t>
-            </w:r>
-          </w:p>
-          <w:p>
-            <w:pPr>
-              <w:spacing w:before="10" w:after="10"/>
-            </w:pPr>
-            <w:r>
-              <w:rPr>
-                <w:color w:val="1F2A37"/>
-                <w:sz w:val="18"/>
-              </w:rPr>
-              <w:t xml:space="preserve">     ›  AWS · Redes: VPC, subnets públicas/privadas, Security Groups, ALB/NLB, Route 53 y PrivateLink</w:t>
-            </w:r>
-          </w:p>
-          <w:p>
-            <w:pPr>
-              <w:spacing w:before="10" w:after="10"/>
-            </w:pPr>
-            <w:r>
-              <w:rPr>
-                <w:color w:val="1F2A37"/>
-                <w:sz w:val="18"/>
-              </w:rPr>
-              <w:t xml:space="preserve">     ›  AWS · Almacenamiento: S3 (lifecycle, versioning), EBS, EFS y ECR</w:t>
-            </w:r>
-          </w:p>
-          <w:p>
-            <w:pPr>
-              <w:spacing w:before="10" w:after="10"/>
-            </w:pPr>
-            <w:r>
-              <w:rPr>
-                <w:color w:val="1F2A37"/>
-                <w:sz w:val="18"/>
-              </w:rPr>
-              <w:t xml:space="preserve">     ›  AWS · Servicios gestionados: RDS, DynamoDB, SQS, CloudWatch y Secrets Manager</w:t>
-            </w:r>
-          </w:p>
-          <w:p>
-            <w:pPr>
-              <w:spacing w:before="10" w:after="10"/>
-            </w:pPr>
-            <w:r>
-              <w:rPr>
-                <w:color w:val="1F2A37"/>
-                <w:sz w:val="18"/>
-              </w:rPr>
-              <w:t xml:space="preserve">     ›  Azure · IAM: Entra ID, Managed Identities, RBAC y Azure Key Vault</w:t>
-            </w:r>
-          </w:p>
-          <w:p>
-            <w:pPr>
-              <w:spacing w:before="10" w:after="10"/>
-            </w:pPr>
-            <w:r>
-              <w:rPr>
-                <w:color w:val="1F2A37"/>
-                <w:sz w:val="18"/>
-              </w:rPr>
-              <w:t xml:space="preserve">     ›  Azure · Computación: VMs, VMSS, Azure Functions y Azure Container Apps</w:t>
-            </w:r>
-          </w:p>
-          <w:p>
-            <w:pPr>
-              <w:spacing w:before="10" w:after="10"/>
-            </w:pPr>
-            <w:r>
-              <w:rPr>
-                <w:color w:val="1F2A37"/>
-                <w:sz w:val="18"/>
-              </w:rPr>
-              <w:t xml:space="preserve">     ›  Azure · Redes: VNet, subnets, NSG, Load Balancer, Application Gateway y Azure DNS</w:t>
-            </w:r>
-          </w:p>
-          <w:p>
-            <w:pPr>
-              <w:spacing w:before="10" w:after="10"/>
-            </w:pPr>
-            <w:r>
-              <w:rPr>
-                <w:color w:val="1F2A37"/>
-                <w:sz w:val="18"/>
-              </w:rPr>
-              <w:t xml:space="preserve">     ›  Azure · Almacenamiento: Blob Storage, Azure Files, Managed Disks y ACR</w:t>
-            </w:r>
-          </w:p>
-          <w:p>
-            <w:pPr>
-              <w:spacing w:before="10" w:after="10"/>
-            </w:pPr>
-            <w:r>
-              <w:rPr>
-                <w:color w:val="1F2A37"/>
-                <w:sz w:val="18"/>
-              </w:rPr>
-              <w:t xml:space="preserve">     ›  Azure · Servicios gestionados: Azure SQL, Cosmos DB, Service Bus y Azure Monitor</w:t>
-            </w:r>
-          </w:p>
-          <w:p>
-            <w:pPr>
-              <w:spacing w:before="10" w:after="10"/>
-            </w:pPr>
-            <w:r>
-              <w:rPr>
-                <w:color w:val="1F2A37"/>
-                <w:sz w:val="18"/>
-              </w:rPr>
-              <w:t xml:space="preserve">     ›  GCP · IAM: Service Accounts, Workload Identity, org policies y Cloud Audit Logs</w:t>
-            </w:r>
-          </w:p>
-          <w:p>
-            <w:pPr>
-              <w:spacing w:before="10" w:after="10"/>
-            </w:pPr>
-            <w:r>
-              <w:rPr>
-                <w:color w:val="1F2A37"/>
-                <w:sz w:val="18"/>
-              </w:rPr>
-              <w:t xml:space="preserve">     ›  GCP · Computación: Compute Engine, Cloud Functions y Cloud Run</w:t>
-            </w:r>
-          </w:p>
-          <w:p>
-            <w:pPr>
-              <w:spacing w:before="10" w:after="10"/>
-            </w:pPr>
-            <w:r>
-              <w:rPr>
-                <w:color w:val="1F2A37"/>
-                <w:sz w:val="18"/>
-              </w:rPr>
-              <w:t xml:space="preserve">     ›  GCP · Redes: VPC, Firewall Rules, Cloud NAT, Cloud Load Balancing y Cloud DNS</w:t>
-            </w:r>
-          </w:p>
-          <w:p>
-            <w:pPr>
-              <w:spacing w:before="10" w:after="10"/>
-            </w:pPr>
-            <w:r>
-              <w:rPr>
-                <w:color w:val="1F2A37"/>
-                <w:sz w:val="18"/>
-              </w:rPr>
-              <w:t xml:space="preserve">     ›  GCP · Almacenamiento: Cloud Storage, Persistent Disk y Artifact Registry</w:t>
-            </w:r>
-          </w:p>
-          <w:p>
-            <w:pPr>
-              <w:spacing w:before="10" w:after="10"/>
-            </w:pPr>
-            <w:r>
-              <w:rPr>
-                <w:color w:val="1F2A37"/>
-                <w:sz w:val="18"/>
-              </w:rPr>
-              <w:t xml:space="preserve">     ›  GCP · Servicios gestionados: Cloud SQL, Firestore, Pub/Sub y Cloud Monitoring</w:t>
-            </w:r>
-          </w:p>
-          <w:p>
-            <w:pPr>
-              <w:spacing w:before="10" w:after="10"/>
-            </w:pPr>
-            <w:r>
-              <w:rPr>
-                <w:color w:val="1F2A37"/>
-                <w:sz w:val="18"/>
-              </w:rPr>
-              <w:t xml:space="preserve">     ›  Comparativa multi-cloud: estrategias de portabilidad, vendor lock-in y abstracción de recursos</w:t>
-            </w:r>
-          </w:p>
-          <w:p>
-            <w:pPr>
-              <w:spacing w:before="40" w:after="20"/>
-            </w:pPr>
-            <w:r>
-              <w:rPr>
-                <w:b/>
-                <w:color w:val="1A56DB"/>
-                <w:sz w:val="20"/>
-              </w:rPr>
-              <w:t>▸ Infraestructura como Código con Terraform</w:t>
-            </w:r>
-          </w:p>
-          <w:p>
-            <w:pPr>
-              <w:spacing w:before="10" w:after="10"/>
-            </w:pPr>
-            <w:r>
-              <w:rPr>
-                <w:color w:val="1F2A37"/>
-                <w:sz w:val="18"/>
-              </w:rPr>
-              <w:t xml:space="preserve">     ›  Fundamentos de IaC: filosofía declarativa vs imperativa, idempotencia y drift detection</w:t>
-            </w:r>
-          </w:p>
-          <w:p>
-            <w:pPr>
-              <w:spacing w:before="10" w:after="10"/>
-            </w:pPr>
-            <w:r>
-              <w:rPr>
-                <w:color w:val="1F2A37"/>
-                <w:sz w:val="18"/>
-              </w:rPr>
-              <w:t xml:space="preserve">     ›  HCL: sintaxis, tipos de datos, expresiones, funciones y meta-argumentos (count, for_each, depends_on)</w:t>
-            </w:r>
-          </w:p>
-          <w:p>
-            <w:pPr>
-              <w:spacing w:before="10" w:after="10"/>
-            </w:pPr>
-            <w:r>
-              <w:rPr>
-                <w:color w:val="1F2A37"/>
-                <w:sz w:val="18"/>
-              </w:rPr>
-              <w:t xml:space="preserve">     ›  Providers: configuración, autenticación y uso de los providers de AWS, Azure y GCP</w:t>
-            </w:r>
-          </w:p>
-          <w:p>
-            <w:pPr>
-              <w:spacing w:before="10" w:after="10"/>
-            </w:pPr>
-            <w:r>
-              <w:rPr>
-                <w:color w:val="1F2A37"/>
-                <w:sz w:val="18"/>
-              </w:rPr>
-              <w:t xml:space="preserve">     ›  State management: local vs remote state, state locking, backends (S3, GCS, Azure Blob) y workspaces</w:t>
-            </w:r>
-          </w:p>
-          <w:p>
-            <w:pPr>
-              <w:spacing w:before="10" w:after="10"/>
-            </w:pPr>
-            <w:r>
-              <w:rPr>
-                <w:color w:val="1F2A37"/>
-                <w:sz w:val="18"/>
-              </w:rPr>
-              <w:t xml:space="preserve">     ›  Módulos: diseño, versionado, registro público y privado, composición y reusabilidad</w:t>
-            </w:r>
-          </w:p>
-          <w:p>
-            <w:pPr>
-              <w:spacing w:before="10" w:after="10"/>
-            </w:pPr>
-            <w:r>
-              <w:rPr>
-                <w:color w:val="1F2A37"/>
-                <w:sz w:val="18"/>
-              </w:rPr>
-              <w:t xml:space="preserve">     ›  Patrones avanzados: for_each, dynamic blocks, moved blocks, import y workspaces</w:t>
-            </w:r>
-          </w:p>
-          <w:p>
-            <w:pPr>
-              <w:spacing w:before="10" w:after="10"/>
-            </w:pPr>
-            <w:r>
-              <w:rPr>
-                <w:color w:val="1F2A37"/>
-                <w:sz w:val="18"/>
-              </w:rPr>
-              <w:t xml:space="preserve">     ›  Terraform en CI/CD: plan/apply automatizado, Atlantis y GitHub Actions</w:t>
-            </w:r>
-          </w:p>
-          <w:p>
-            <w:pPr>
-              <w:spacing w:before="10" w:after="10"/>
-            </w:pPr>
-            <w:r>
-              <w:rPr>
-                <w:color w:val="1F2A37"/>
-                <w:sz w:val="18"/>
-              </w:rPr>
-              <w:t xml:space="preserve">     ›  Testing de infraestructura: terraform test, tflint, checkov, tfsec y políticas con OPA/Conftest</w:t>
-            </w:r>
-          </w:p>
-          <w:p>
-            <w:pPr>
-              <w:spacing w:before="10" w:after="10"/>
-            </w:pPr>
-            <w:r>
-              <w:rPr>
-                <w:color w:val="1F2A37"/>
-                <w:sz w:val="18"/>
-              </w:rPr>
-              <w:t xml:space="preserve">     ›  Alternativas complementarias: OpenTofu, Pulumi y CDKTF</w:t>
+              <w:t xml:space="preserve">     ›  Pulumi: comparación de 10–15 minutos de HCL frente a Python/Go con un ejemplo equivalente pequeño; también requiere gestión de estado; sin instalación ni laboratorio propio</w:t>
             </w:r>
           </w:p>
         </w:tc>
@@ -2584,7 +2199,7 @@
                 <w:color w:val="1A56DB"/>
                 <w:sz w:val="22"/>
               </w:rPr>
-              <w:t>M5 | 2 ECTS · 18h</w:t>
+              <w:t>M5 | 2 ECTS · 21h</w:t>
             </w:r>
             <w:r>
               <w:rPr>
@@ -2602,7 +2217,7 @@
                 <w:color w:val="4B5563"/>
                 <w:sz w:val="20"/>
               </w:rPr>
-              <w:t>Stack de observabilidad completo: Prometheus, Grafana (Loki, Tempo, Mimir), OpenTelemetry, repartido en 3 sesiones (métricas, logs, trazas+correlación) para un ritmo sostenible. GitOps con ArgoCD y Prow. Pipelines con Tekton. Networking avanzado con Traefik e Istio (service mesh). Estrategias de despliegue (canary, blue/green) con Argo Rollouts. Escalado de workloads (HPA, VPA, KEDA, Karpenter).</w:t>
+              <w:t>Stack de observabilidad completo: Prometheus, Grafana (Loki, Tempo, Mimir), OpenTelemetry, repartido en 3 sesiones (métricas, logs, trazas+correlación) para un ritmo sostenible. Git básico y principios GitOps junto a ArgoCD. Sesión propia de pipelines CI/CD con Prow y Tekton. Networking avanzado con Traefik e Istio (service mesh). Estrategias de despliegue (canary, blue/green) con Argo Rollouts. Escalado de workloads (HPA, VPA, KEDA, Karpenter).</w:t>
             </w:r>
           </w:p>
           <w:p>
@@ -2798,7 +2413,7 @@
                 <w:color w:val="1A56DB"/>
                 <w:sz w:val="20"/>
               </w:rPr>
-              <w:t>▸ GitOps y Pipelines CI/CD</w:t>
+              <w:t>▸ Git y GitOps con ArgoCD</w:t>
             </w:r>
           </w:p>
           <w:p>
@@ -2810,7 +2425,7 @@
                 <w:color w:val="1F2A37"/>
                 <w:sz w:val="18"/>
               </w:rPr>
-              <w:t xml:space="preserve">     ›  Principios GitOps: declarativo, versionado, automatizado, reconciliado. Pull vs Push model</w:t>
+              <w:t xml:space="preserve">     ›  Git para el repositorio de manifiestos: ramas, commits, PR, revisión y conflictos sencillos; sin Git avanzado</w:t>
             </w:r>
           </w:p>
           <w:p>
@@ -2822,7 +2437,7 @@
                 <w:color w:val="1F2A37"/>
                 <w:sz w:val="18"/>
               </w:rPr>
-              <w:t xml:space="preserve">     ›  ArgoCD: Applications, AppProjects, ApplicationSets, sync policies, waves, hooks y RBAC</w:t>
+              <w:t xml:space="preserve">     ›  Principios GitOps: declarativo, versionado, automatizado, reconciliado. Pull vs Push model</w:t>
             </w:r>
           </w:p>
           <w:p>
@@ -2834,7 +2449,7 @@
                 <w:color w:val="1F2A37"/>
                 <w:sz w:val="18"/>
               </w:rPr>
-              <w:t xml:space="preserve">     ›  ArgoCD avanzado: multi-tenancy, SSO, App of Apps, ApplicationSet generators y notifications</w:t>
+              <w:t xml:space="preserve">     ›  ArgoCD: Applications, AppProjects, ApplicationSets, sync policies, waves, hooks y RBAC</w:t>
             </w:r>
           </w:p>
           <w:p>
@@ -2846,7 +2461,44 @@
                 <w:color w:val="1F2A37"/>
                 <w:sz w:val="18"/>
               </w:rPr>
-              <w:t xml:space="preserve">     ›  ArgoCD Image Updater y Argo Rollouts: patrones de Progressive Delivery con análisis automático</w:t>
+              <w:t xml:space="preserve">     ›  ArgoCD avanzado: multi-tenancy, SSO, App of Apps, ApplicationSet generators y notifications</w:t>
+            </w:r>
+          </w:p>
+          <w:p>
+            <w:pPr>
+              <w:spacing w:before="10" w:after="10"/>
+            </w:pPr>
+            <w:r>
+              <w:rPr>
+                <w:color w:val="1F2A37"/>
+                <w:sz w:val="18"/>
+              </w:rPr>
+              <w:t xml:space="preserve">     ›  Práctica: modificar un manifiesto, revisar el PR, sincronizar con ArgoCD y observar la reconciliación</w:t>
+            </w:r>
+          </w:p>
+          <w:p>
+            <w:pPr>
+              <w:spacing w:before="40" w:after="20"/>
+            </w:pPr>
+            <w:r>
+              <w:rPr>
+                <w:b/>
+                <w:color w:val="1A56DB"/>
+                <w:sz w:val="20"/>
+              </w:rPr>
+              <w:t>▸ Pipelines CI/CD: Prow y Tekton</w:t>
+            </w:r>
+          </w:p>
+          <w:p>
+            <w:pPr>
+              <w:spacing w:before="10" w:after="10"/>
+            </w:pPr>
+            <w:r>
+              <w:rPr>
+                <w:color w:val="1F2A37"/>
+                <w:sz w:val="18"/>
+              </w:rPr>
+              <w:t xml:space="preserve">     ›  Git aplicado a CI: cambios y PR como disparadores de validaciones y pipelines</w:t>
             </w:r>
           </w:p>
           <w:p>

</xml_diff>